<commit_message>
Fix T variable indexing: shift T1..T10 to T0..T9 to match vnmsim display
</commit_message>
<xml_diff>
--- a/CSStruct/Practical_2_Von_Neumann_Solutions_v2.docx
+++ b/CSStruct/Practical_2_Von_Neumann_Solutions_v2.docx
@@ -3308,7 +3308,7 @@
           <w:rFonts w:ascii="Consolas" w:hAnsi="Consolas"/>
           <w:sz w:val="18"/>
         </w:rPr>
-        <w:t>JMZ 11 // X = 0 -&gt; keep T1 and T2 unchanged</w:t>
+        <w:t>JMZ 11 // X = 0 -&gt; keep T0 and T1 unchanged</w:t>
         <w:br/>
       </w:r>
       <w:r>
@@ -3340,7 +3340,7 @@
           <w:rFonts w:ascii="Consolas" w:hAnsi="Consolas"/>
           <w:sz w:val="18"/>
         </w:rPr>
-        <w:t>LOD T1 // save the original first number</w:t>
+        <w:t>LOD T0 // save the original first number</w:t>
         <w:br/>
       </w:r>
       <w:r>
@@ -3348,7 +3348,7 @@
           <w:rFonts w:ascii="Consolas" w:hAnsi="Consolas"/>
           <w:sz w:val="18"/>
         </w:rPr>
-        <w:t>STO T3 // use T3 as temporary storage</w:t>
+        <w:t>STO T2 // use T2 as temporary storage</w:t>
         <w:br/>
       </w:r>
       <w:r>
@@ -3356,7 +3356,7 @@
           <w:rFonts w:ascii="Consolas" w:hAnsi="Consolas"/>
           <w:sz w:val="18"/>
         </w:rPr>
-        <w:t>LOD T2 // load the second number</w:t>
+        <w:t>LOD T1 // load the second number</w:t>
         <w:br/>
       </w:r>
       <w:r>
@@ -3364,7 +3364,7 @@
           <w:rFonts w:ascii="Consolas" w:hAnsi="Consolas"/>
           <w:sz w:val="18"/>
         </w:rPr>
-        <w:t>STO T1 // copy T2 into T1</w:t>
+        <w:t>STO T0 // copy T1 into T0</w:t>
         <w:br/>
       </w:r>
       <w:r>
@@ -3372,7 +3372,7 @@
           <w:rFonts w:ascii="Consolas" w:hAnsi="Consolas"/>
           <w:sz w:val="18"/>
         </w:rPr>
-        <w:t>LOD T3 // recover the original T1 value</w:t>
+        <w:t>LOD T2 // recover the original T0 value</w:t>
         <w:br/>
       </w:r>
       <w:r>
@@ -3380,7 +3380,7 @@
           <w:rFonts w:ascii="Consolas" w:hAnsi="Consolas"/>
           <w:sz w:val="18"/>
         </w:rPr>
-        <w:t>STO T2 // copy the original T1 into T2</w:t>
+        <w:t>STO T1 // copy the original T0 into T1</w:t>
         <w:br/>
       </w:r>
       <w:r>
@@ -4172,7 +4172,15 @@
           <w:rFonts w:ascii="Consolas" w:hAnsi="Consolas"/>
           <w:sz w:val="18"/>
         </w:rPr>
-        <w:t>LOD T1 // start full-array sum</w:t>
+        <w:t>LOD T0 // start full-array sum</w:t>
+        <w:br/>
+      </w:r>
+      <w:r>
+        <w:rPr>
+          <w:rFonts w:ascii="Consolas" w:hAnsi="Consolas"/>
+          <w:sz w:val="18"/>
+        </w:rPr>
+        <w:t>ADD T1 // add T1</w:t>
         <w:br/>
       </w:r>
       <w:r>
@@ -4244,14 +4252,6 @@
           <w:rFonts w:ascii="Consolas" w:hAnsi="Consolas"/>
           <w:sz w:val="18"/>
         </w:rPr>
-        <w:t>ADD T10 // add T10</w:t>
-        <w:br/>
-      </w:r>
-      <w:r>
-        <w:rPr>
-          <w:rFonts w:ascii="Consolas" w:hAnsi="Consolas"/>
-          <w:sz w:val="18"/>
-        </w:rPr>
         <w:t>STO W // store the total sum in W</w:t>
         <w:br/>
       </w:r>
@@ -4268,7 +4268,15 @@
           <w:rFonts w:ascii="Consolas" w:hAnsi="Consolas"/>
           <w:sz w:val="18"/>
         </w:rPr>
-        <w:t>LOD T1 // start first-half sum</w:t>
+        <w:t>LOD T0 // start first-half sum</w:t>
+        <w:br/>
+      </w:r>
+      <w:r>
+        <w:rPr>
+          <w:rFonts w:ascii="Consolas" w:hAnsi="Consolas"/>
+          <w:sz w:val="18"/>
+        </w:rPr>
+        <w:t>ADD T1 // add T1</w:t>
         <w:br/>
       </w:r>
       <w:r>
@@ -4300,15 +4308,7 @@
           <w:rFonts w:ascii="Consolas" w:hAnsi="Consolas"/>
           <w:sz w:val="18"/>
         </w:rPr>
-        <w:t>ADD T5 // add T5</w:t>
-        <w:br/>
-      </w:r>
-      <w:r>
-        <w:rPr>
-          <w:rFonts w:ascii="Consolas" w:hAnsi="Consolas"/>
-          <w:sz w:val="18"/>
-        </w:rPr>
-        <w:t>STO W // store the sum of T1..T5 in W</w:t>
+        <w:t>STO W // store the sum of T0..T4 in W</w:t>
         <w:br/>
       </w:r>
       <w:r>
@@ -4324,7 +4324,15 @@
           <w:rFonts w:ascii="Consolas" w:hAnsi="Consolas"/>
           <w:sz w:val="18"/>
         </w:rPr>
-        <w:t>LOD T6 // start second-half sum</w:t>
+        <w:t>LOD T5 // start second-half sum</w:t>
+        <w:br/>
+      </w:r>
+      <w:r>
+        <w:rPr>
+          <w:rFonts w:ascii="Consolas" w:hAnsi="Consolas"/>
+          <w:sz w:val="18"/>
+        </w:rPr>
+        <w:t>ADD T6 // add T6</w:t>
         <w:br/>
       </w:r>
       <w:r>
@@ -4356,15 +4364,7 @@
           <w:rFonts w:ascii="Consolas" w:hAnsi="Consolas"/>
           <w:sz w:val="18"/>
         </w:rPr>
-        <w:t>ADD T10 // add T10</w:t>
-        <w:br/>
-      </w:r>
-      <w:r>
-        <w:rPr>
-          <w:rFonts w:ascii="Consolas" w:hAnsi="Consolas"/>
-          <w:sz w:val="18"/>
-        </w:rPr>
-        <w:t>STO W // store the sum of T6..T10 in W</w:t>
+        <w:t>STO W // store the sum of T5..T9 in W</w:t>
         <w:br/>
       </w:r>
       <w:r>

</xml_diff>

<commit_message>
Update EX3 content and documentation consistency
</commit_message>
<xml_diff>
--- a/CSStruct/Practical_2_Von_Neumann_Solutions_v2.docx
+++ b/CSStruct/Practical_2_Von_Neumann_Solutions_v2.docx
@@ -3288,7 +3288,7 @@
         <w:pStyle w:val="Heading3"/>
       </w:pPr>
       <w:r>
-        <w:t>Program code</w:t>
+        <w:t>Program text (`P1_EX3_initials.txt`)</w:t>
       </w:r>
     </w:p>
     <w:p>
@@ -3308,7 +3308,7 @@
           <w:rFonts w:ascii="Consolas" w:hAnsi="Consolas"/>
           <w:sz w:val="18"/>
         </w:rPr>
-        <w:t>JMZ 11 // X = 0 -&gt; keep T0 and T1 unchanged</w:t>
+        <w:t>JMZ 11 // X = 0 -&gt; keep T1 and T2 unchanged</w:t>
         <w:br/>
       </w:r>
       <w:r>
@@ -3340,7 +3340,7 @@
           <w:rFonts w:ascii="Consolas" w:hAnsi="Consolas"/>
           <w:sz w:val="18"/>
         </w:rPr>
-        <w:t>LOD T0 // save the original first number</w:t>
+        <w:t>LOD T1 // save the original first number</w:t>
         <w:br/>
       </w:r>
       <w:r>
@@ -3348,7 +3348,7 @@
           <w:rFonts w:ascii="Consolas" w:hAnsi="Consolas"/>
           <w:sz w:val="18"/>
         </w:rPr>
-        <w:t>STO T2 // use T2 as temporary storage</w:t>
+        <w:t>STO T3 // use T3 as temporary storage</w:t>
         <w:br/>
       </w:r>
       <w:r>
@@ -3356,7 +3356,7 @@
           <w:rFonts w:ascii="Consolas" w:hAnsi="Consolas"/>
           <w:sz w:val="18"/>
         </w:rPr>
-        <w:t>LOD T1 // load the second number</w:t>
+        <w:t>LOD T2 // load the second number</w:t>
         <w:br/>
       </w:r>
       <w:r>
@@ -3364,7 +3364,7 @@
           <w:rFonts w:ascii="Consolas" w:hAnsi="Consolas"/>
           <w:sz w:val="18"/>
         </w:rPr>
-        <w:t>STO T0 // copy T1 into T0</w:t>
+        <w:t>STO T1 // copy T2 into T1</w:t>
         <w:br/>
       </w:r>
       <w:r>
@@ -3372,7 +3372,7 @@
           <w:rFonts w:ascii="Consolas" w:hAnsi="Consolas"/>
           <w:sz w:val="18"/>
         </w:rPr>
-        <w:t>LOD T2 // recover the original T0 value</w:t>
+        <w:t>LOD T3 // recover the original T1 value</w:t>
         <w:br/>
       </w:r>
       <w:r>
@@ -3380,7 +3380,7 @@
           <w:rFonts w:ascii="Consolas" w:hAnsi="Consolas"/>
           <w:sz w:val="18"/>
         </w:rPr>
-        <w:t>STO T1 // copy the original T0 into T1</w:t>
+        <w:t>STO T2 // copy the original T1 into T2</w:t>
         <w:br/>
       </w:r>
       <w:r>
@@ -3397,6 +3397,54 @@
       </w:pPr>
       <w:r>
         <w:t>Example test cases</w:t>
+      </w:r>
+    </w:p>
+    <w:p>
+      <w:pPr/>
+      <w:r>
+        <w:rPr>
+          <w:b w:val="0"/>
+        </w:rPr>
+        <w:t xml:space="preserve">The imported JSON scenarios keep </w:t>
+      </w:r>
+      <w:r>
+        <w:rPr>
+          <w:rFonts w:ascii="Consolas" w:hAnsi="Consolas"/>
+          <w:sz w:val="18"/>
+        </w:rPr>
+        <w:t>T0=0</w:t>
+      </w:r>
+      <w:r>
+        <w:rPr>
+          <w:b w:val="0"/>
+        </w:rPr>
+        <w:t xml:space="preserve"> as padding so the intended data cells are </w:t>
+      </w:r>
+      <w:r>
+        <w:rPr>
+          <w:rFonts w:ascii="Consolas" w:hAnsi="Consolas"/>
+          <w:sz w:val="18"/>
+        </w:rPr>
+        <w:t>T1</w:t>
+      </w:r>
+      <w:r>
+        <w:rPr>
+          <w:b w:val="0"/>
+        </w:rPr>
+        <w:t xml:space="preserve"> and </w:t>
+      </w:r>
+      <w:r>
+        <w:rPr>
+          <w:rFonts w:ascii="Consolas" w:hAnsi="Consolas"/>
+          <w:sz w:val="18"/>
+        </w:rPr>
+        <w:t>T2</w:t>
+      </w:r>
+      <w:r>
+        <w:rPr>
+          <w:b w:val="0"/>
+        </w:rPr>
+        <w:t>.</w:t>
       </w:r>
     </w:p>
     <w:tbl>
@@ -3489,7 +3537,7 @@
                 <w:rFonts w:ascii="Consolas" w:hAnsi="Consolas"/>
                 <w:sz w:val="18"/>
               </w:rPr>
-              <w:t>X=0, T1=8, T2=3, T3=0</w:t>
+              <w:t>X=0, T0=0, T1=8, T2=3, T3=0</w:t>
             </w:r>
           </w:p>
         </w:tc>
@@ -3503,7 +3551,7 @@
                 <w:rFonts w:ascii="Consolas" w:hAnsi="Consolas"/>
                 <w:sz w:val="18"/>
               </w:rPr>
-              <w:t>T1=8, T2=3</w:t>
+              <w:t>T0=0, T1=8, T2=3, T3=0</w:t>
             </w:r>
           </w:p>
         </w:tc>
@@ -3545,7 +3593,7 @@
                 <w:rFonts w:ascii="Consolas" w:hAnsi="Consolas"/>
                 <w:sz w:val="18"/>
               </w:rPr>
-              <w:t>X=1, T1=8, T2=3, T3=0</w:t>
+              <w:t>X=1, T0=0, T1=8, T2=3, T3=0</w:t>
             </w:r>
           </w:p>
         </w:tc>
@@ -3559,7 +3607,7 @@
                 <w:rFonts w:ascii="Consolas" w:hAnsi="Consolas"/>
                 <w:sz w:val="18"/>
               </w:rPr>
-              <w:t>T1=3, T2=8</w:t>
+              <w:t>T0=0, T1=3, T2=8, T3=8</w:t>
             </w:r>
           </w:p>
         </w:tc>
@@ -3601,7 +3649,7 @@
                 <w:rFonts w:ascii="Consolas" w:hAnsi="Consolas"/>
                 <w:sz w:val="18"/>
               </w:rPr>
-              <w:t>X=2, T1=8, T2=3, T3=0</w:t>
+              <w:t>X=2, T0=0, T1=8, T2=3, T3=0</w:t>
             </w:r>
           </w:p>
         </w:tc>
@@ -3615,7 +3663,7 @@
                 <w:rFonts w:ascii="Consolas" w:hAnsi="Consolas"/>
                 <w:sz w:val="18"/>
               </w:rPr>
-              <w:t>T1=8, T2=3</w:t>
+              <w:t>T0=0, T1=8, T2=3, T3=0</w:t>
             </w:r>
           </w:p>
         </w:tc>
@@ -3729,7 +3777,95 @@
         <w:rPr>
           <w:b w:val="0"/>
         </w:rPr>
-        <w:t xml:space="preserve">Take one screenshot before execution and one after </w:t>
+        <w:t>Capture these screenshots for documentation:</w:t>
+      </w:r>
+    </w:p>
+    <w:p>
+      <w:pPr>
+        <w:pStyle w:val="ListNumber"/>
+      </w:pPr>
+      <w:r>
+        <w:rPr>
+          <w:rFonts w:ascii="Consolas" w:hAnsi="Consolas"/>
+          <w:sz w:val="18"/>
+        </w:rPr>
+        <w:t>X = 0</w:t>
+      </w:r>
+      <w:r>
+        <w:rPr>
+          <w:b w:val="0"/>
+        </w:rPr>
+        <w:t xml:space="preserve"> case, before running: show </w:t>
+      </w:r>
+      <w:r>
+        <w:rPr>
+          <w:rFonts w:ascii="Consolas" w:hAnsi="Consolas"/>
+          <w:sz w:val="18"/>
+        </w:rPr>
+        <w:t>T0=0</w:t>
+      </w:r>
+      <w:r>
+        <w:rPr>
+          <w:b w:val="0"/>
+        </w:rPr>
+        <w:t xml:space="preserve">, </w:t>
+      </w:r>
+      <w:r>
+        <w:rPr>
+          <w:rFonts w:ascii="Consolas" w:hAnsi="Consolas"/>
+          <w:sz w:val="18"/>
+        </w:rPr>
+        <w:t>T1=8</w:t>
+      </w:r>
+      <w:r>
+        <w:rPr>
+          <w:b w:val="0"/>
+        </w:rPr>
+        <w:t xml:space="preserve">, </w:t>
+      </w:r>
+      <w:r>
+        <w:rPr>
+          <w:rFonts w:ascii="Consolas" w:hAnsi="Consolas"/>
+          <w:sz w:val="18"/>
+        </w:rPr>
+        <w:t>T2=3</w:t>
+      </w:r>
+      <w:r>
+        <w:rPr>
+          <w:b w:val="0"/>
+        </w:rPr>
+        <w:t xml:space="preserve">, and </w:t>
+      </w:r>
+      <w:r>
+        <w:rPr>
+          <w:rFonts w:ascii="Consolas" w:hAnsi="Consolas"/>
+          <w:sz w:val="18"/>
+        </w:rPr>
+        <w:t>PC</w:t>
+      </w:r>
+      <w:r>
+        <w:rPr>
+          <w:b w:val="0"/>
+        </w:rPr>
+        <w:t xml:space="preserve"> at line 0.</w:t>
+      </w:r>
+    </w:p>
+    <w:p>
+      <w:pPr>
+        <w:pStyle w:val="ListNumber"/>
+      </w:pPr>
+      <w:r>
+        <w:rPr>
+          <w:rFonts w:ascii="Consolas" w:hAnsi="Consolas"/>
+          <w:sz w:val="18"/>
+        </w:rPr>
+        <w:t>X = 0</w:t>
+      </w:r>
+      <w:r>
+        <w:rPr>
+          <w:b w:val="0"/>
+        </w:rPr>
+        <w:t xml:space="preserve"> case, after </w:t>
       </w:r>
       <w:r>
         <w:rPr>
@@ -3742,7 +3878,208 @@
         <w:rPr>
           <w:b w:val="0"/>
         </w:rPr>
+        <w:t xml:space="preserve">: show </w:t>
+      </w:r>
+      <w:r>
+        <w:rPr>
+          <w:rFonts w:ascii="Consolas" w:hAnsi="Consolas"/>
+          <w:sz w:val="18"/>
+        </w:rPr>
+        <w:t>T1=8</w:t>
+      </w:r>
+      <w:r>
+        <w:rPr>
+          <w:b w:val="0"/>
+        </w:rPr>
+        <w:t xml:space="preserve">, </w:t>
+      </w:r>
+      <w:r>
+        <w:rPr>
+          <w:rFonts w:ascii="Consolas" w:hAnsi="Consolas"/>
+          <w:sz w:val="18"/>
+        </w:rPr>
+        <w:t>T2=3</w:t>
+      </w:r>
+      <w:r>
+        <w:rPr>
+          <w:b w:val="0"/>
+        </w:rPr>
+        <w:t xml:space="preserve"> unchanged.</w:t>
+      </w:r>
+    </w:p>
+    <w:p>
+      <w:pPr>
+        <w:pStyle w:val="ListNumber"/>
+      </w:pPr>
+      <w:r>
+        <w:rPr>
+          <w:rFonts w:ascii="Consolas" w:hAnsi="Consolas"/>
+          <w:sz w:val="18"/>
+        </w:rPr>
+        <w:t>X = 1</w:t>
+      </w:r>
+      <w:r>
+        <w:rPr>
+          <w:b w:val="0"/>
+        </w:rPr>
+        <w:t xml:space="preserve"> case, before running: show </w:t>
+      </w:r>
+      <w:r>
+        <w:rPr>
+          <w:rFonts w:ascii="Consolas" w:hAnsi="Consolas"/>
+          <w:sz w:val="18"/>
+        </w:rPr>
+        <w:t>T0=0</w:t>
+      </w:r>
+      <w:r>
+        <w:rPr>
+          <w:b w:val="0"/>
+        </w:rPr>
+        <w:t xml:space="preserve">, </w:t>
+      </w:r>
+      <w:r>
+        <w:rPr>
+          <w:rFonts w:ascii="Consolas" w:hAnsi="Consolas"/>
+          <w:sz w:val="18"/>
+        </w:rPr>
+        <w:t>T1=8</w:t>
+      </w:r>
+      <w:r>
+        <w:rPr>
+          <w:b w:val="0"/>
+        </w:rPr>
+        <w:t xml:space="preserve">, </w:t>
+      </w:r>
+      <w:r>
+        <w:rPr>
+          <w:rFonts w:ascii="Consolas" w:hAnsi="Consolas"/>
+          <w:sz w:val="18"/>
+        </w:rPr>
+        <w:t>T2=3</w:t>
+      </w:r>
+      <w:r>
+        <w:rPr>
+          <w:b w:val="0"/>
+        </w:rPr>
         <w:t>.</w:t>
+      </w:r>
+    </w:p>
+    <w:p>
+      <w:pPr>
+        <w:pStyle w:val="ListNumber"/>
+      </w:pPr>
+      <w:r>
+        <w:rPr>
+          <w:rFonts w:ascii="Consolas" w:hAnsi="Consolas"/>
+          <w:sz w:val="18"/>
+        </w:rPr>
+        <w:t>X = 1</w:t>
+      </w:r>
+      <w:r>
+        <w:rPr>
+          <w:b w:val="0"/>
+        </w:rPr>
+        <w:t xml:space="preserve"> case, after </w:t>
+      </w:r>
+      <w:r>
+        <w:rPr>
+          <w:rFonts w:ascii="Consolas" w:hAnsi="Consolas"/>
+          <w:sz w:val="18"/>
+        </w:rPr>
+        <w:t>HLT</w:t>
+      </w:r>
+      <w:r>
+        <w:rPr>
+          <w:b w:val="0"/>
+        </w:rPr>
+        <w:t xml:space="preserve">: show </w:t>
+      </w:r>
+      <w:r>
+        <w:rPr>
+          <w:rFonts w:ascii="Consolas" w:hAnsi="Consolas"/>
+          <w:sz w:val="18"/>
+        </w:rPr>
+        <w:t>T1=3</w:t>
+      </w:r>
+      <w:r>
+        <w:rPr>
+          <w:b w:val="0"/>
+        </w:rPr>
+        <w:t xml:space="preserve">, </w:t>
+      </w:r>
+      <w:r>
+        <w:rPr>
+          <w:rFonts w:ascii="Consolas" w:hAnsi="Consolas"/>
+          <w:sz w:val="18"/>
+        </w:rPr>
+        <w:t>T2=8</w:t>
+      </w:r>
+      <w:r>
+        <w:rPr>
+          <w:b w:val="0"/>
+        </w:rPr>
+        <w:t xml:space="preserve">, and temporary </w:t>
+      </w:r>
+      <w:r>
+        <w:rPr>
+          <w:rFonts w:ascii="Consolas" w:hAnsi="Consolas"/>
+          <w:sz w:val="18"/>
+        </w:rPr>
+        <w:t>T3=8</w:t>
+      </w:r>
+      <w:r>
+        <w:rPr>
+          <w:b w:val="0"/>
+        </w:rPr>
+        <w:t>.</w:t>
+      </w:r>
+    </w:p>
+    <w:p>
+      <w:pPr/>
+      <w:r>
+        <w:rPr>
+          <w:b w:val="0"/>
+        </w:rPr>
+        <w:t xml:space="preserve">Note: when importing JSON into vnmsim, the scenario includes </w:t>
+      </w:r>
+      <w:r>
+        <w:rPr>
+          <w:rFonts w:ascii="Consolas" w:hAnsi="Consolas"/>
+          <w:sz w:val="18"/>
+        </w:rPr>
+        <w:t>T0=0</w:t>
+      </w:r>
+      <w:r>
+        <w:rPr>
+          <w:b w:val="0"/>
+        </w:rPr>
+        <w:t xml:space="preserve"> as padding so that </w:t>
+      </w:r>
+      <w:r>
+        <w:rPr>
+          <w:rFonts w:ascii="Consolas" w:hAnsi="Consolas"/>
+          <w:sz w:val="18"/>
+        </w:rPr>
+        <w:t>T1</w:t>
+      </w:r>
+      <w:r>
+        <w:rPr>
+          <w:b w:val="0"/>
+        </w:rPr>
+        <w:t xml:space="preserve"> and </w:t>
+      </w:r>
+      <w:r>
+        <w:rPr>
+          <w:rFonts w:ascii="Consolas" w:hAnsi="Consolas"/>
+          <w:sz w:val="18"/>
+        </w:rPr>
+        <w:t>T2</w:t>
+      </w:r>
+      <w:r>
+        <w:rPr>
+          <w:b w:val="0"/>
+        </w:rPr>
+        <w:t xml:space="preserve"> map correctly in the UI and in program execution.</w:t>
       </w:r>
     </w:p>
     <w:p>

</xml_diff>